<commit_message>
FS-HU-21 a FS-HU-24 y FS-HU-05: Inicio con sesion, busqueda de profesionales con filtros y cercania, favoritos y resenas
Logo al Inicio, menu de la cuenta y diseno comun con menu lateral y barra inferior; portada redisenada; migraciones comuna/modalidad, favoritos y resenas; pruebas (backend 129, frontend 100) y documentacion (DAS v1.14, backlog, historias, Sprint 3, CP-036 a CP-049, defectos 8 a 14).
</commit_message>
<xml_diff>
--- a/FASE 1/Evidencias Grupales/Material complementario/Documento_de_Épicas_e_Historias_de_Usuario.docx
+++ b/FASE 1/Evidencias Grupales/Material complementario/Documento_de_Épicas_e_Historias_de_Usuario.docx
@@ -1651,6 +1651,92 @@
           </w:p>
         </w:tc>
       </w:tr>
+      <w:tr>
+        <w:tc>
+          <w:tcPr>
+            <w:tcW w:w="1826" w:type="dxa"/>
+          </w:tcPr>
+          <w:p>
+            <w:pPr>
+              <w:tabs>
+                <w:tab w:val="left" w:pos="1276"/>
+              </w:tabs>
+              <w:rPr>
+                <w:rFonts w:eastAsia="Times New Roman" w:cstheme="minorHAnsi"/>
+                <w:color w:val="000000" w:themeColor="text1"/>
+                <w:sz w:val="24"/>
+                <w:szCs w:val="24"/>
+              </w:rPr>
+            </w:pPr>
+            <w:r>
+              <w:t>1.5</w:t>
+            </w:r>
+          </w:p>
+        </w:tc>
+        <w:tc>
+          <w:tcPr>
+            <w:tcW w:w="1826" w:type="dxa"/>
+          </w:tcPr>
+          <w:p>
+            <w:pPr>
+              <w:tabs>
+                <w:tab w:val="left" w:pos="1276"/>
+              </w:tabs>
+              <w:rPr>
+                <w:rFonts w:eastAsia="Times New Roman" w:cstheme="minorHAnsi"/>
+                <w:color w:val="000000" w:themeColor="text1"/>
+                <w:sz w:val="24"/>
+                <w:szCs w:val="24"/>
+              </w:rPr>
+            </w:pPr>
+            <w:r>
+              <w:t>03-10-2026</w:t>
+            </w:r>
+          </w:p>
+        </w:tc>
+        <w:tc>
+          <w:tcPr>
+            <w:tcW w:w="3081" w:type="dxa"/>
+          </w:tcPr>
+          <w:p>
+            <w:pPr>
+              <w:tabs>
+                <w:tab w:val="left" w:pos="1276"/>
+              </w:tabs>
+              <w:rPr>
+                <w:rFonts w:eastAsia="Times New Roman" w:cstheme="minorHAnsi"/>
+                <w:color w:val="000000" w:themeColor="text1"/>
+                <w:sz w:val="24"/>
+                <w:szCs w:val="24"/>
+              </w:rPr>
+            </w:pPr>
+            <w:r>
+              <w:t>Se agregan FS-HU-21 (Inicio personalizado y navegación, E1), FS-HU-22 (búsqueda avanzada de profesionales, E3), FS-HU-23 (profesionales favoritos, E2) y FS-HU-24 (calificar y reseñar profesionales, E2), a partir del mockup del Inicio; se ajusta FS-HU-20 (con la sesión iniciada la portada lleva al Inicio)</w:t>
+            </w:r>
+          </w:p>
+        </w:tc>
+        <w:tc>
+          <w:tcPr>
+            <w:tcW w:w="2245" w:type="dxa"/>
+          </w:tcPr>
+          <w:p>
+            <w:pPr>
+              <w:tabs>
+                <w:tab w:val="left" w:pos="1276"/>
+              </w:tabs>
+              <w:rPr>
+                <w:rFonts w:eastAsia="Times New Roman" w:cstheme="minorHAnsi"/>
+                <w:color w:val="000000" w:themeColor="text1"/>
+                <w:sz w:val="24"/>
+                <w:szCs w:val="24"/>
+              </w:rPr>
+            </w:pPr>
+            <w:r>
+              <w:t>Rodrigo Cárcamo Rojas</w:t>
+            </w:r>
+          </w:p>
+        </w:tc>
+      </w:tr>
     </w:tbl>
     <w:p>
       <w:pPr>
@@ -3081,6 +3167,18 @@
                 <w:sz w:val="21"/>
               </w:rPr>
               <w:t>También en el Sprint 2 se agregó a E1 FS-HU-20 (prioridad Media): la portada pública presenta FitSearch a quien aún no tiene sesión y lo lleva al registro o al inicio de sesión.</w:t>
+            </w:r>
+          </w:p>
+          <w:p>
+            <w:r>
+              <w:rPr>
+                <w:rFonts w:ascii="Calibri" w:hAnsi="Calibri"/>
+                <w:b w:val="0"/>
+                <w:i w:val="0"/>
+                <w:color w:val="000000"/>
+                <w:sz w:val="21"/>
+              </w:rPr>
+              <w:t>En el Sprint 3 (historias agregadas el 03-10-2026 a partir del mockup del Inicio) se incorporaron FS-HU-21 a E1 (prioridad Alta: un Inicio con acceso a todas las secciones), FS-HU-22 a E3 (Alta: búsqueda por texto con filtros, junto con la cercanía de FS-HU-05) y, a E2, FS-HU-23 (Media: profesionales favoritos) y FS-HU-24 (Alta: calificaciones y reseñas), porque ayudan a comparar y elegir profesionales con la opinión de otras personas. Sus criterios de aceptación están en la plantilla de historias de usuario.</w:t>
             </w:r>
           </w:p>
         </w:tc>

</xml_diff>

<commit_message>
Matriz de cambios SC-12 a SC-17, Product Backlog y Epicas con las 24 historias, Vision 1.1 y mailmap
</commit_message>
<xml_diff>
--- a/FASE 1/Evidencias Grupales/Material complementario/Documento_de_Épicas_e_Historias_de_Usuario.docx
+++ b/FASE 1/Evidencias Grupales/Material complementario/Documento_de_Épicas_e_Historias_de_Usuario.docx
@@ -1737,6 +1737,92 @@
           </w:p>
         </w:tc>
       </w:tr>
+      <w:tr>
+        <w:tc>
+          <w:tcPr>
+            <w:tcW w:w="1826" w:type="dxa"/>
+          </w:tcPr>
+          <w:p>
+            <w:pPr>
+              <w:tabs>
+                <w:tab w:val="left" w:pos="1276"/>
+              </w:tabs>
+              <w:rPr>
+                <w:rFonts w:eastAsia="Times New Roman" w:cstheme="minorHAnsi"/>
+                <w:color w:val="000000" w:themeColor="text1"/>
+                <w:sz w:val="24"/>
+                <w:szCs w:val="24"/>
+              </w:rPr>
+            </w:pPr>
+            <w:r>
+              <w:t>1.6</w:t>
+            </w:r>
+          </w:p>
+        </w:tc>
+        <w:tc>
+          <w:tcPr>
+            <w:tcW w:w="1826" w:type="dxa"/>
+          </w:tcPr>
+          <w:p>
+            <w:pPr>
+              <w:tabs>
+                <w:tab w:val="left" w:pos="1276"/>
+              </w:tabs>
+              <w:rPr>
+                <w:rFonts w:eastAsia="Times New Roman" w:cstheme="minorHAnsi"/>
+                <w:color w:val="000000" w:themeColor="text1"/>
+                <w:sz w:val="24"/>
+                <w:szCs w:val="24"/>
+              </w:rPr>
+            </w:pPr>
+            <w:r>
+              <w:t>12-10-2026</w:t>
+            </w:r>
+          </w:p>
+        </w:tc>
+        <w:tc>
+          <w:tcPr>
+            <w:tcW w:w="3081" w:type="dxa"/>
+          </w:tcPr>
+          <w:p>
+            <w:pPr>
+              <w:tabs>
+                <w:tab w:val="left" w:pos="1276"/>
+              </w:tabs>
+              <w:rPr>
+                <w:rFonts w:eastAsia="Times New Roman" w:cstheme="minorHAnsi"/>
+                <w:color w:val="000000" w:themeColor="text1"/>
+                <w:sz w:val="24"/>
+                <w:szCs w:val="24"/>
+              </w:rPr>
+            </w:pPr>
+            <w:r>
+              <w:t>Se insertan las imágenes de las 24 historias desde la plantilla de historias de usuario (se agregan FS-HU-12 a FS-HU-24 y se actualizan FS-HU-01 a FS-HU-11). Se registran los cambios del Sprint 3: FS-HU-12 se reubica del Sprint 5 al Sprint 3 con el panel del administrador; el tipo de cuenta se elige una sola vez en una pantalla propia y no en el asistente de perfil; FS-HU-14 suma el escenario 4 (una reserva activa por usuario con cada profesional)</w:t>
+            </w:r>
+          </w:p>
+        </w:tc>
+        <w:tc>
+          <w:tcPr>
+            <w:tcW w:w="2245" w:type="dxa"/>
+          </w:tcPr>
+          <w:p>
+            <w:pPr>
+              <w:tabs>
+                <w:tab w:val="left" w:pos="1276"/>
+              </w:tabs>
+              <w:rPr>
+                <w:rFonts w:eastAsia="Times New Roman" w:cstheme="minorHAnsi"/>
+                <w:color w:val="000000" w:themeColor="text1"/>
+                <w:sz w:val="24"/>
+                <w:szCs w:val="24"/>
+              </w:rPr>
+            </w:pPr>
+            <w:r>
+              <w:t>Rodrigo Cárcamo Rojas</w:t>
+            </w:r>
+          </w:p>
+        </w:tc>
+      </w:tr>
     </w:tbl>
     <w:p>
       <w:pPr>
@@ -3179,6 +3265,18 @@
                 <w:sz w:val="21"/>
               </w:rPr>
               <w:t>En el Sprint 3 (historias agregadas el 03-10-2026 a partir del mockup del Inicio) se incorporaron FS-HU-21 a E1 (prioridad Alta: un Inicio con acceso a todas las secciones), FS-HU-22 a E3 (Alta: búsqueda por texto con filtros, junto con la cercanía de FS-HU-05) y, a E2, FS-HU-23 (Media: profesionales favoritos) y FS-HU-24 (Alta: calificaciones y reseñas), porque ayudan a comparar y elegir profesionales con la opinión de otras personas. Sus criterios de aceptación están en la plantilla de historias de usuario.</w:t>
+            </w:r>
+          </w:p>
+          <w:p>
+            <w:r>
+              <w:rPr>
+                <w:rFonts w:ascii="Calibri" w:hAnsi="Calibri"/>
+                <w:b w:val="0"/>
+                <w:i w:val="0"/>
+                <w:color w:val="000000"/>
+                <w:sz w:val="21"/>
+              </w:rPr>
+              <w:t>Durante el Sprint 3 (12-10-2026), FS-HU-12 «Verificar perfiles profesionales» (E2, prioridad Baja) se reubicó del Sprint 5 al Sprint 3, porque se implementó junto con el panel del administrador, y el Product Owner la aceptó. El tipo de cuenta pasó a elegirse una sola vez en una pantalla propia después del registro, en lugar del primer paso del asistente de perfil (ajuste del 24-09-2026). FS-HU-14 agregó el límite de una reserva activa por usuario con cada profesional. Las prioridades de las épicas no cambian.</w:t>
             </w:r>
           </w:p>
         </w:tc>
@@ -3734,7 +3832,7 @@
       <w:r>
         <w:drawing>
           <wp:inline xmlns:a="http://schemas.openxmlformats.org/drawingml/2006/main" xmlns:pic="http://schemas.openxmlformats.org/drawingml/2006/picture">
-            <wp:extent cx="5760720" cy="1130321"/>
+            <wp:extent cx="5760720" cy="1290401"/>
             <wp:docPr id="2" name="Picture 2"/>
             <wp:cNvGraphicFramePr>
               <a:graphicFrameLocks noChangeAspect="1"/>
@@ -3755,7 +3853,7 @@
                   <pic:spPr>
                     <a:xfrm>
                       <a:off x="0" y="0"/>
-                      <a:ext cx="5760720" cy="1130321"/>
+                      <a:ext cx="5760720" cy="1290401"/>
                     </a:xfrm>
                     <a:prstGeom prst="rect"/>
                   </pic:spPr>
@@ -3780,7 +3878,7 @@
       <w:r>
         <w:drawing>
           <wp:inline xmlns:a="http://schemas.openxmlformats.org/drawingml/2006/main" xmlns:pic="http://schemas.openxmlformats.org/drawingml/2006/picture">
-            <wp:extent cx="5760720" cy="1130321"/>
+            <wp:extent cx="5760720" cy="1785823"/>
             <wp:docPr id="3" name="Picture 3"/>
             <wp:cNvGraphicFramePr>
               <a:graphicFrameLocks noChangeAspect="1"/>
@@ -3801,7 +3899,7 @@
                   <pic:spPr>
                     <a:xfrm>
                       <a:off x="0" y="0"/>
-                      <a:ext cx="5760720" cy="1130321"/>
+                      <a:ext cx="5760720" cy="1785823"/>
                     </a:xfrm>
                     <a:prstGeom prst="rect"/>
                   </pic:spPr>
@@ -3826,7 +3924,7 @@
       <w:r>
         <w:drawing>
           <wp:inline xmlns:a="http://schemas.openxmlformats.org/drawingml/2006/main" xmlns:pic="http://schemas.openxmlformats.org/drawingml/2006/picture">
-            <wp:extent cx="5760720" cy="1130321"/>
+            <wp:extent cx="5760720" cy="1212631"/>
             <wp:docPr id="4" name="Picture 4"/>
             <wp:cNvGraphicFramePr>
               <a:graphicFrameLocks noChangeAspect="1"/>
@@ -3847,7 +3945,7 @@
                   <pic:spPr>
                     <a:xfrm>
                       <a:off x="0" y="0"/>
-                      <a:ext cx="5760720" cy="1130321"/>
+                      <a:ext cx="5760720" cy="1212631"/>
                     </a:xfrm>
                     <a:prstGeom prst="rect"/>
                   </pic:spPr>
@@ -3872,7 +3970,7 @@
       <w:r>
         <w:drawing>
           <wp:inline xmlns:a="http://schemas.openxmlformats.org/drawingml/2006/main" xmlns:pic="http://schemas.openxmlformats.org/drawingml/2006/picture">
-            <wp:extent cx="5760720" cy="1130321"/>
+            <wp:extent cx="5760720" cy="1448821"/>
             <wp:docPr id="5" name="Picture 5"/>
             <wp:cNvGraphicFramePr>
               <a:graphicFrameLocks noChangeAspect="1"/>
@@ -3893,7 +3991,7 @@
                   <pic:spPr>
                     <a:xfrm>
                       <a:off x="0" y="0"/>
-                      <a:ext cx="5760720" cy="1130321"/>
+                      <a:ext cx="5760720" cy="1448821"/>
                     </a:xfrm>
                     <a:prstGeom prst="rect"/>
                   </pic:spPr>
@@ -3918,7 +4016,7 @@
       <w:r>
         <w:drawing>
           <wp:inline xmlns:a="http://schemas.openxmlformats.org/drawingml/2006/main" xmlns:pic="http://schemas.openxmlformats.org/drawingml/2006/picture">
-            <wp:extent cx="5760720" cy="1130321"/>
+            <wp:extent cx="5760720" cy="1212631"/>
             <wp:docPr id="6" name="Picture 6"/>
             <wp:cNvGraphicFramePr>
               <a:graphicFrameLocks noChangeAspect="1"/>
@@ -3939,7 +4037,7 @@
                   <pic:spPr>
                     <a:xfrm>
                       <a:off x="0" y="0"/>
-                      <a:ext cx="5760720" cy="1130321"/>
+                      <a:ext cx="5760720" cy="1212631"/>
                     </a:xfrm>
                     <a:prstGeom prst="rect"/>
                   </pic:spPr>
@@ -3964,7 +4062,7 @@
       <w:r>
         <w:drawing>
           <wp:inline xmlns:a="http://schemas.openxmlformats.org/drawingml/2006/main" xmlns:pic="http://schemas.openxmlformats.org/drawingml/2006/picture">
-            <wp:extent cx="5760720" cy="1130321"/>
+            <wp:extent cx="5760720" cy="1131981"/>
             <wp:docPr id="7" name="Picture 7"/>
             <wp:cNvGraphicFramePr>
               <a:graphicFrameLocks noChangeAspect="1"/>
@@ -3985,7 +4083,7 @@
                   <pic:spPr>
                     <a:xfrm>
                       <a:off x="0" y="0"/>
-                      <a:ext cx="5760720" cy="1130321"/>
+                      <a:ext cx="5760720" cy="1131981"/>
                     </a:xfrm>
                     <a:prstGeom prst="rect"/>
                   </pic:spPr>
@@ -4010,7 +4108,7 @@
       <w:r>
         <w:drawing>
           <wp:inline xmlns:a="http://schemas.openxmlformats.org/drawingml/2006/main" xmlns:pic="http://schemas.openxmlformats.org/drawingml/2006/picture">
-            <wp:extent cx="5760720" cy="1130321"/>
+            <wp:extent cx="5760720" cy="1212631"/>
             <wp:docPr id="8" name="Picture 8"/>
             <wp:cNvGraphicFramePr>
               <a:graphicFrameLocks noChangeAspect="1"/>
@@ -4031,7 +4129,7 @@
                   <pic:spPr>
                     <a:xfrm>
                       <a:off x="0" y="0"/>
-                      <a:ext cx="5760720" cy="1130321"/>
+                      <a:ext cx="5760720" cy="1212631"/>
                     </a:xfrm>
                     <a:prstGeom prst="rect"/>
                   </pic:spPr>
@@ -4056,7 +4154,7 @@
       <w:r>
         <w:drawing>
           <wp:inline xmlns:a="http://schemas.openxmlformats.org/drawingml/2006/main" xmlns:pic="http://schemas.openxmlformats.org/drawingml/2006/picture">
-            <wp:extent cx="5760720" cy="1130321"/>
+            <wp:extent cx="5760720" cy="1212631"/>
             <wp:docPr id="9" name="Picture 9"/>
             <wp:cNvGraphicFramePr>
               <a:graphicFrameLocks noChangeAspect="1"/>
@@ -4077,7 +4175,7 @@
                   <pic:spPr>
                     <a:xfrm>
                       <a:off x="0" y="0"/>
-                      <a:ext cx="5760720" cy="1130321"/>
+                      <a:ext cx="5760720" cy="1212631"/>
                     </a:xfrm>
                     <a:prstGeom prst="rect"/>
                   </pic:spPr>
@@ -4102,7 +4200,7 @@
       <w:r>
         <w:drawing>
           <wp:inline xmlns:a="http://schemas.openxmlformats.org/drawingml/2006/main" xmlns:pic="http://schemas.openxmlformats.org/drawingml/2006/picture">
-            <wp:extent cx="5760720" cy="1130321"/>
+            <wp:extent cx="5760720" cy="1212631"/>
             <wp:docPr id="10" name="Picture 10"/>
             <wp:cNvGraphicFramePr>
               <a:graphicFrameLocks noChangeAspect="1"/>
@@ -4123,7 +4221,7 @@
                   <pic:spPr>
                     <a:xfrm>
                       <a:off x="0" y="0"/>
-                      <a:ext cx="5760720" cy="1130321"/>
+                      <a:ext cx="5760720" cy="1212631"/>
                     </a:xfrm>
                     <a:prstGeom prst="rect"/>
                   </pic:spPr>
@@ -4148,7 +4246,7 @@
       <w:r>
         <w:drawing>
           <wp:inline xmlns:a="http://schemas.openxmlformats.org/drawingml/2006/main" xmlns:pic="http://schemas.openxmlformats.org/drawingml/2006/picture">
-            <wp:extent cx="5760720" cy="1130321"/>
+            <wp:extent cx="5760720" cy="1290401"/>
             <wp:docPr id="11" name="Picture 11"/>
             <wp:cNvGraphicFramePr>
               <a:graphicFrameLocks noChangeAspect="1"/>
@@ -4169,7 +4267,7 @@
                   <pic:spPr>
                     <a:xfrm>
                       <a:off x="0" y="0"/>
-                      <a:ext cx="5760720" cy="1130321"/>
+                      <a:ext cx="5760720" cy="1290401"/>
                     </a:xfrm>
                     <a:prstGeom prst="rect"/>
                   </pic:spPr>
@@ -4194,7 +4292,7 @@
       <w:r>
         <w:drawing>
           <wp:inline xmlns:a="http://schemas.openxmlformats.org/drawingml/2006/main" xmlns:pic="http://schemas.openxmlformats.org/drawingml/2006/picture">
-            <wp:extent cx="5760720" cy="1130321"/>
+            <wp:extent cx="5760720" cy="1131981"/>
             <wp:docPr id="12" name="Picture 12"/>
             <wp:cNvGraphicFramePr>
               <a:graphicFrameLocks noChangeAspect="1"/>
@@ -4215,7 +4313,605 @@
                   <pic:spPr>
                     <a:xfrm>
                       <a:off x="0" y="0"/>
-                      <a:ext cx="5760720" cy="1130321"/>
+                      <a:ext cx="5760720" cy="1131981"/>
+                    </a:xfrm>
+                    <a:prstGeom prst="rect"/>
+                  </pic:spPr>
+                </pic:pic>
+              </a:graphicData>
+            </a:graphic>
+          </wp:inline>
+        </w:drawing>
+      </w:r>
+    </w:p>
+    <w:p>
+      <w:r>
+        <w:rPr>
+          <w:rFonts w:ascii="Calibri" w:hAnsi="Calibri"/>
+          <w:b/>
+          <w:sz w:val="24"/>
+        </w:rPr>
+        <w:t>Historia 12 — FS-HU-12: Verificar perfiles profesionales</w:t>
+      </w:r>
+    </w:p>
+    <w:p>
+      <w:r>
+        <w:drawing>
+          <wp:inline xmlns:a="http://schemas.openxmlformats.org/drawingml/2006/main" xmlns:pic="http://schemas.openxmlformats.org/drawingml/2006/picture">
+            <wp:extent cx="5760720" cy="1290401"/>
+            <wp:docPr id="13" name="Picture 13"/>
+            <wp:cNvGraphicFramePr>
+              <a:graphicFrameLocks noChangeAspect="1"/>
+            </wp:cNvGraphicFramePr>
+            <a:graphic>
+              <a:graphicData uri="http://schemas.openxmlformats.org/drawingml/2006/picture">
+                <pic:pic>
+                  <pic:nvPicPr>
+                    <pic:cNvPr id="0" name="FS-HU-12.png"/>
+                    <pic:cNvPicPr/>
+                  </pic:nvPicPr>
+                  <pic:blipFill>
+                    <a:blip r:embed="rId24"/>
+                    <a:stretch>
+                      <a:fillRect/>
+                    </a:stretch>
+                  </pic:blipFill>
+                  <pic:spPr>
+                    <a:xfrm>
+                      <a:off x="0" y="0"/>
+                      <a:ext cx="5760720" cy="1290401"/>
+                    </a:xfrm>
+                    <a:prstGeom prst="rect"/>
+                  </pic:spPr>
+                </pic:pic>
+              </a:graphicData>
+            </a:graphic>
+          </wp:inline>
+        </w:drawing>
+      </w:r>
+    </w:p>
+    <w:p>
+      <w:r>
+        <w:rPr>
+          <w:rFonts w:ascii="Calibri" w:hAnsi="Calibri"/>
+          <w:b/>
+          <w:sz w:val="24"/>
+        </w:rPr>
+        <w:t>Historia 13 — FS-HU-13: Disponibilidad del profesional</w:t>
+      </w:r>
+    </w:p>
+    <w:p>
+      <w:r>
+        <w:drawing>
+          <wp:inline xmlns:a="http://schemas.openxmlformats.org/drawingml/2006/main" xmlns:pic="http://schemas.openxmlformats.org/drawingml/2006/picture">
+            <wp:extent cx="5760720" cy="1368171"/>
+            <wp:docPr id="14" name="Picture 14"/>
+            <wp:cNvGraphicFramePr>
+              <a:graphicFrameLocks noChangeAspect="1"/>
+            </wp:cNvGraphicFramePr>
+            <a:graphic>
+              <a:graphicData uri="http://schemas.openxmlformats.org/drawingml/2006/picture">
+                <pic:pic>
+                  <pic:nvPicPr>
+                    <pic:cNvPr id="0" name="FS-HU-13.png"/>
+                    <pic:cNvPicPr/>
+                  </pic:nvPicPr>
+                  <pic:blipFill>
+                    <a:blip r:embed="rId25"/>
+                    <a:stretch>
+                      <a:fillRect/>
+                    </a:stretch>
+                  </pic:blipFill>
+                  <pic:spPr>
+                    <a:xfrm>
+                      <a:off x="0" y="0"/>
+                      <a:ext cx="5760720" cy="1368171"/>
+                    </a:xfrm>
+                    <a:prstGeom prst="rect"/>
+                  </pic:spPr>
+                </pic:pic>
+              </a:graphicData>
+            </a:graphic>
+          </wp:inline>
+        </w:drawing>
+      </w:r>
+    </w:p>
+    <w:p>
+      <w:r>
+        <w:rPr>
+          <w:rFonts w:ascii="Calibri" w:hAnsi="Calibri"/>
+          <w:b/>
+          <w:sz w:val="24"/>
+        </w:rPr>
+        <w:t>Historia 14 — FS-HU-14: Reservar hora</w:t>
+      </w:r>
+    </w:p>
+    <w:p>
+      <w:r>
+        <w:drawing>
+          <wp:inline xmlns:a="http://schemas.openxmlformats.org/drawingml/2006/main" xmlns:pic="http://schemas.openxmlformats.org/drawingml/2006/picture">
+            <wp:extent cx="5760720" cy="2356134"/>
+            <wp:docPr id="15" name="Picture 15"/>
+            <wp:cNvGraphicFramePr>
+              <a:graphicFrameLocks noChangeAspect="1"/>
+            </wp:cNvGraphicFramePr>
+            <a:graphic>
+              <a:graphicData uri="http://schemas.openxmlformats.org/drawingml/2006/picture">
+                <pic:pic>
+                  <pic:nvPicPr>
+                    <pic:cNvPr id="0" name="FS-HU-14.png"/>
+                    <pic:cNvPicPr/>
+                  </pic:nvPicPr>
+                  <pic:blipFill>
+                    <a:blip r:embed="rId26"/>
+                    <a:stretch>
+                      <a:fillRect/>
+                    </a:stretch>
+                  </pic:blipFill>
+                  <pic:spPr>
+                    <a:xfrm>
+                      <a:off x="0" y="0"/>
+                      <a:ext cx="5760720" cy="2356134"/>
+                    </a:xfrm>
+                    <a:prstGeom prst="rect"/>
+                  </pic:spPr>
+                </pic:pic>
+              </a:graphicData>
+            </a:graphic>
+          </wp:inline>
+        </w:drawing>
+      </w:r>
+    </w:p>
+    <w:p>
+      <w:r>
+        <w:rPr>
+          <w:rFonts w:ascii="Calibri" w:hAnsi="Calibri"/>
+          <w:b/>
+          <w:sz w:val="24"/>
+        </w:rPr>
+        <w:t>Historia 15 — FS-HU-15: Recuperar contraseña</w:t>
+      </w:r>
+    </w:p>
+    <w:p>
+      <w:r>
+        <w:drawing>
+          <wp:inline xmlns:a="http://schemas.openxmlformats.org/drawingml/2006/main" xmlns:pic="http://schemas.openxmlformats.org/drawingml/2006/picture">
+            <wp:extent cx="5760720" cy="2019132"/>
+            <wp:docPr id="16" name="Picture 16"/>
+            <wp:cNvGraphicFramePr>
+              <a:graphicFrameLocks noChangeAspect="1"/>
+            </wp:cNvGraphicFramePr>
+            <a:graphic>
+              <a:graphicData uri="http://schemas.openxmlformats.org/drawingml/2006/picture">
+                <pic:pic>
+                  <pic:nvPicPr>
+                    <pic:cNvPr id="0" name="FS-HU-15.png"/>
+                    <pic:cNvPicPr/>
+                  </pic:nvPicPr>
+                  <pic:blipFill>
+                    <a:blip r:embed="rId27"/>
+                    <a:stretch>
+                      <a:fillRect/>
+                    </a:stretch>
+                  </pic:blipFill>
+                  <pic:spPr>
+                    <a:xfrm>
+                      <a:off x="0" y="0"/>
+                      <a:ext cx="5760720" cy="2019132"/>
+                    </a:xfrm>
+                    <a:prstGeom prst="rect"/>
+                  </pic:spPr>
+                </pic:pic>
+              </a:graphicData>
+            </a:graphic>
+          </wp:inline>
+        </w:drawing>
+      </w:r>
+    </w:p>
+    <w:p>
+      <w:r>
+        <w:rPr>
+          <w:rFonts w:ascii="Calibri" w:hAnsi="Calibri"/>
+          <w:b/>
+          <w:sz w:val="24"/>
+        </w:rPr>
+        <w:t>Historia 16 — FS-HU-16: Acceso con Google</w:t>
+      </w:r>
+    </w:p>
+    <w:p>
+      <w:r>
+        <w:drawing>
+          <wp:inline xmlns:a="http://schemas.openxmlformats.org/drawingml/2006/main" xmlns:pic="http://schemas.openxmlformats.org/drawingml/2006/picture">
+            <wp:extent cx="5760720" cy="1627403"/>
+            <wp:docPr id="17" name="Picture 17"/>
+            <wp:cNvGraphicFramePr>
+              <a:graphicFrameLocks noChangeAspect="1"/>
+            </wp:cNvGraphicFramePr>
+            <a:graphic>
+              <a:graphicData uri="http://schemas.openxmlformats.org/drawingml/2006/picture">
+                <pic:pic>
+                  <pic:nvPicPr>
+                    <pic:cNvPr id="0" name="FS-HU-16.png"/>
+                    <pic:cNvPicPr/>
+                  </pic:nvPicPr>
+                  <pic:blipFill>
+                    <a:blip r:embed="rId28"/>
+                    <a:stretch>
+                      <a:fillRect/>
+                    </a:stretch>
+                  </pic:blipFill>
+                  <pic:spPr>
+                    <a:xfrm>
+                      <a:off x="0" y="0"/>
+                      <a:ext cx="5760720" cy="1627403"/>
+                    </a:xfrm>
+                    <a:prstGeom prst="rect"/>
+                  </pic:spPr>
+                </pic:pic>
+              </a:graphicData>
+            </a:graphic>
+          </wp:inline>
+        </w:drawing>
+      </w:r>
+    </w:p>
+    <w:p>
+      <w:r>
+        <w:rPr>
+          <w:rFonts w:ascii="Calibri" w:hAnsi="Calibri"/>
+          <w:b/>
+          <w:sz w:val="24"/>
+        </w:rPr>
+        <w:t>Historia 17 — FS-HU-17: Registro con contraseña confirmada y sesión recordada</w:t>
+      </w:r>
+    </w:p>
+    <w:p>
+      <w:r>
+        <w:drawing>
+          <wp:inline xmlns:a="http://schemas.openxmlformats.org/drawingml/2006/main" xmlns:pic="http://schemas.openxmlformats.org/drawingml/2006/picture">
+            <wp:extent cx="5760720" cy="1468984"/>
+            <wp:docPr id="18" name="Picture 18"/>
+            <wp:cNvGraphicFramePr>
+              <a:graphicFrameLocks noChangeAspect="1"/>
+            </wp:cNvGraphicFramePr>
+            <a:graphic>
+              <a:graphicData uri="http://schemas.openxmlformats.org/drawingml/2006/picture">
+                <pic:pic>
+                  <pic:nvPicPr>
+                    <pic:cNvPr id="0" name="FS-HU-17.png"/>
+                    <pic:cNvPicPr/>
+                  </pic:nvPicPr>
+                  <pic:blipFill>
+                    <a:blip r:embed="rId29"/>
+                    <a:stretch>
+                      <a:fillRect/>
+                    </a:stretch>
+                  </pic:blipFill>
+                  <pic:spPr>
+                    <a:xfrm>
+                      <a:off x="0" y="0"/>
+                      <a:ext cx="5760720" cy="1468984"/>
+                    </a:xfrm>
+                    <a:prstGeom prst="rect"/>
+                  </pic:spPr>
+                </pic:pic>
+              </a:graphicData>
+            </a:graphic>
+          </wp:inline>
+        </w:drawing>
+      </w:r>
+    </w:p>
+    <w:p>
+      <w:r>
+        <w:rPr>
+          <w:rFonts w:ascii="Calibri" w:hAnsi="Calibri"/>
+          <w:b/>
+          <w:sz w:val="24"/>
+        </w:rPr>
+        <w:t>Historia 18 — FS-HU-18: Objetivos y estilo de vida</w:t>
+      </w:r>
+    </w:p>
+    <w:p>
+      <w:r>
+        <w:drawing>
+          <wp:inline xmlns:a="http://schemas.openxmlformats.org/drawingml/2006/main" xmlns:pic="http://schemas.openxmlformats.org/drawingml/2006/picture">
+            <wp:extent cx="5760720" cy="1863593"/>
+            <wp:docPr id="19" name="Picture 19"/>
+            <wp:cNvGraphicFramePr>
+              <a:graphicFrameLocks noChangeAspect="1"/>
+            </wp:cNvGraphicFramePr>
+            <a:graphic>
+              <a:graphicData uri="http://schemas.openxmlformats.org/drawingml/2006/picture">
+                <pic:pic>
+                  <pic:nvPicPr>
+                    <pic:cNvPr id="0" name="FS-HU-18.png"/>
+                    <pic:cNvPicPr/>
+                  </pic:nvPicPr>
+                  <pic:blipFill>
+                    <a:blip r:embed="rId30"/>
+                    <a:stretch>
+                      <a:fillRect/>
+                    </a:stretch>
+                  </pic:blipFill>
+                  <pic:spPr>
+                    <a:xfrm>
+                      <a:off x="0" y="0"/>
+                      <a:ext cx="5760720" cy="1863593"/>
+                    </a:xfrm>
+                    <a:prstGeom prst="rect"/>
+                  </pic:spPr>
+                </pic:pic>
+              </a:graphicData>
+            </a:graphic>
+          </wp:inline>
+        </w:drawing>
+      </w:r>
+    </w:p>
+    <w:p>
+      <w:r>
+        <w:rPr>
+          <w:rFonts w:ascii="Calibri" w:hAnsi="Calibri"/>
+          <w:b/>
+          <w:sz w:val="24"/>
+        </w:rPr>
+        <w:t>Historia 19 — FS-HU-19: Información de salud</w:t>
+      </w:r>
+    </w:p>
+    <w:p>
+      <w:r>
+        <w:drawing>
+          <wp:inline xmlns:a="http://schemas.openxmlformats.org/drawingml/2006/main" xmlns:pic="http://schemas.openxmlformats.org/drawingml/2006/picture">
+            <wp:extent cx="5760720" cy="2099782"/>
+            <wp:docPr id="20" name="Picture 20"/>
+            <wp:cNvGraphicFramePr>
+              <a:graphicFrameLocks noChangeAspect="1"/>
+            </wp:cNvGraphicFramePr>
+            <a:graphic>
+              <a:graphicData uri="http://schemas.openxmlformats.org/drawingml/2006/picture">
+                <pic:pic>
+                  <pic:nvPicPr>
+                    <pic:cNvPr id="0" name="FS-HU-19.png"/>
+                    <pic:cNvPicPr/>
+                  </pic:nvPicPr>
+                  <pic:blipFill>
+                    <a:blip r:embed="rId31"/>
+                    <a:stretch>
+                      <a:fillRect/>
+                    </a:stretch>
+                  </pic:blipFill>
+                  <pic:spPr>
+                    <a:xfrm>
+                      <a:off x="0" y="0"/>
+                      <a:ext cx="5760720" cy="2099782"/>
+                    </a:xfrm>
+                    <a:prstGeom prst="rect"/>
+                  </pic:spPr>
+                </pic:pic>
+              </a:graphicData>
+            </a:graphic>
+          </wp:inline>
+        </w:drawing>
+      </w:r>
+    </w:p>
+    <w:p>
+      <w:r>
+        <w:rPr>
+          <w:rFonts w:ascii="Calibri" w:hAnsi="Calibri"/>
+          <w:b/>
+          <w:sz w:val="24"/>
+        </w:rPr>
+        <w:t>Historia 20 — FS-HU-20: Portada pública</w:t>
+      </w:r>
+    </w:p>
+    <w:p>
+      <w:r>
+        <w:drawing>
+          <wp:inline xmlns:a="http://schemas.openxmlformats.org/drawingml/2006/main" xmlns:pic="http://schemas.openxmlformats.org/drawingml/2006/picture">
+            <wp:extent cx="5760720" cy="1391214"/>
+            <wp:docPr id="21" name="Picture 21"/>
+            <wp:cNvGraphicFramePr>
+              <a:graphicFrameLocks noChangeAspect="1"/>
+            </wp:cNvGraphicFramePr>
+            <a:graphic>
+              <a:graphicData uri="http://schemas.openxmlformats.org/drawingml/2006/picture">
+                <pic:pic>
+                  <pic:nvPicPr>
+                    <pic:cNvPr id="0" name="FS-HU-20.png"/>
+                    <pic:cNvPicPr/>
+                  </pic:nvPicPr>
+                  <pic:blipFill>
+                    <a:blip r:embed="rId32"/>
+                    <a:stretch>
+                      <a:fillRect/>
+                    </a:stretch>
+                  </pic:blipFill>
+                  <pic:spPr>
+                    <a:xfrm>
+                      <a:off x="0" y="0"/>
+                      <a:ext cx="5760720" cy="1391214"/>
+                    </a:xfrm>
+                    <a:prstGeom prst="rect"/>
+                  </pic:spPr>
+                </pic:pic>
+              </a:graphicData>
+            </a:graphic>
+          </wp:inline>
+        </w:drawing>
+      </w:r>
+    </w:p>
+    <w:p>
+      <w:r>
+        <w:rPr>
+          <w:rFonts w:ascii="Calibri" w:hAnsi="Calibri"/>
+          <w:b/>
+          <w:sz w:val="24"/>
+        </w:rPr>
+        <w:t>Historia 21 — FS-HU-21: Inicio personalizado y navegación</w:t>
+      </w:r>
+    </w:p>
+    <w:p>
+      <w:r>
+        <w:drawing>
+          <wp:inline xmlns:a="http://schemas.openxmlformats.org/drawingml/2006/main" xmlns:pic="http://schemas.openxmlformats.org/drawingml/2006/picture">
+            <wp:extent cx="5760720" cy="1627403"/>
+            <wp:docPr id="22" name="Picture 22"/>
+            <wp:cNvGraphicFramePr>
+              <a:graphicFrameLocks noChangeAspect="1"/>
+            </wp:cNvGraphicFramePr>
+            <a:graphic>
+              <a:graphicData uri="http://schemas.openxmlformats.org/drawingml/2006/picture">
+                <pic:pic>
+                  <pic:nvPicPr>
+                    <pic:cNvPr id="0" name="FS-HU-21.png"/>
+                    <pic:cNvPicPr/>
+                  </pic:nvPicPr>
+                  <pic:blipFill>
+                    <a:blip r:embed="rId33"/>
+                    <a:stretch>
+                      <a:fillRect/>
+                    </a:stretch>
+                  </pic:blipFill>
+                  <pic:spPr>
+                    <a:xfrm>
+                      <a:off x="0" y="0"/>
+                      <a:ext cx="5760720" cy="1627403"/>
+                    </a:xfrm>
+                    <a:prstGeom prst="rect"/>
+                  </pic:spPr>
+                </pic:pic>
+              </a:graphicData>
+            </a:graphic>
+          </wp:inline>
+        </w:drawing>
+      </w:r>
+    </w:p>
+    <w:p>
+      <w:r>
+        <w:rPr>
+          <w:rFonts w:ascii="Calibri" w:hAnsi="Calibri"/>
+          <w:b/>
+          <w:sz w:val="24"/>
+        </w:rPr>
+        <w:t>Historia 22 — FS-HU-22: Búsqueda avanzada de profesionales</w:t>
+      </w:r>
+    </w:p>
+    <w:p>
+      <w:r>
+        <w:drawing>
+          <wp:inline xmlns:a="http://schemas.openxmlformats.org/drawingml/2006/main" xmlns:pic="http://schemas.openxmlformats.org/drawingml/2006/picture">
+            <wp:extent cx="5760720" cy="1705173"/>
+            <wp:docPr id="23" name="Picture 23"/>
+            <wp:cNvGraphicFramePr>
+              <a:graphicFrameLocks noChangeAspect="1"/>
+            </wp:cNvGraphicFramePr>
+            <a:graphic>
+              <a:graphicData uri="http://schemas.openxmlformats.org/drawingml/2006/picture">
+                <pic:pic>
+                  <pic:nvPicPr>
+                    <pic:cNvPr id="0" name="FS-HU-22.png"/>
+                    <pic:cNvPicPr/>
+                  </pic:nvPicPr>
+                  <pic:blipFill>
+                    <a:blip r:embed="rId34"/>
+                    <a:stretch>
+                      <a:fillRect/>
+                    </a:stretch>
+                  </pic:blipFill>
+                  <pic:spPr>
+                    <a:xfrm>
+                      <a:off x="0" y="0"/>
+                      <a:ext cx="5760720" cy="1705173"/>
+                    </a:xfrm>
+                    <a:prstGeom prst="rect"/>
+                  </pic:spPr>
+                </pic:pic>
+              </a:graphicData>
+            </a:graphic>
+          </wp:inline>
+        </w:drawing>
+      </w:r>
+    </w:p>
+    <w:p>
+      <w:r>
+        <w:rPr>
+          <w:rFonts w:ascii="Calibri" w:hAnsi="Calibri"/>
+          <w:b/>
+          <w:sz w:val="24"/>
+        </w:rPr>
+        <w:t>Historia 23 — FS-HU-23: Profesionales favoritos</w:t>
+      </w:r>
+    </w:p>
+    <w:p>
+      <w:r>
+        <w:drawing>
+          <wp:inline xmlns:a="http://schemas.openxmlformats.org/drawingml/2006/main" xmlns:pic="http://schemas.openxmlformats.org/drawingml/2006/picture">
+            <wp:extent cx="5760720" cy="1468984"/>
+            <wp:docPr id="24" name="Picture 24"/>
+            <wp:cNvGraphicFramePr>
+              <a:graphicFrameLocks noChangeAspect="1"/>
+            </wp:cNvGraphicFramePr>
+            <a:graphic>
+              <a:graphicData uri="http://schemas.openxmlformats.org/drawingml/2006/picture">
+                <pic:pic>
+                  <pic:nvPicPr>
+                    <pic:cNvPr id="0" name="FS-HU-23.png"/>
+                    <pic:cNvPicPr/>
+                  </pic:nvPicPr>
+                  <pic:blipFill>
+                    <a:blip r:embed="rId35"/>
+                    <a:stretch>
+                      <a:fillRect/>
+                    </a:stretch>
+                  </pic:blipFill>
+                  <pic:spPr>
+                    <a:xfrm>
+                      <a:off x="0" y="0"/>
+                      <a:ext cx="5760720" cy="1468984"/>
+                    </a:xfrm>
+                    <a:prstGeom prst="rect"/>
+                  </pic:spPr>
+                </pic:pic>
+              </a:graphicData>
+            </a:graphic>
+          </wp:inline>
+        </w:drawing>
+      </w:r>
+    </w:p>
+    <w:p>
+      <w:r>
+        <w:rPr>
+          <w:rFonts w:ascii="Calibri" w:hAnsi="Calibri"/>
+          <w:b/>
+          <w:sz w:val="24"/>
+        </w:rPr>
+        <w:t>Historia 24 — FS-HU-24: Calificar y reseñar profesionales</w:t>
+      </w:r>
+    </w:p>
+    <w:p>
+      <w:r>
+        <w:drawing>
+          <wp:inline xmlns:a="http://schemas.openxmlformats.org/drawingml/2006/main" xmlns:pic="http://schemas.openxmlformats.org/drawingml/2006/picture">
+            <wp:extent cx="5760720" cy="1549634"/>
+            <wp:docPr id="25" name="Picture 25"/>
+            <wp:cNvGraphicFramePr>
+              <a:graphicFrameLocks noChangeAspect="1"/>
+            </wp:cNvGraphicFramePr>
+            <a:graphic>
+              <a:graphicData uri="http://schemas.openxmlformats.org/drawingml/2006/picture">
+                <pic:pic>
+                  <pic:nvPicPr>
+                    <pic:cNvPr id="0" name="FS-HU-24.png"/>
+                    <pic:cNvPicPr/>
+                  </pic:nvPicPr>
+                  <pic:blipFill>
+                    <a:blip r:embed="rId36"/>
+                    <a:stretch>
+                      <a:fillRect/>
+                    </a:stretch>
+                  </pic:blipFill>
+                  <pic:spPr>
+                    <a:xfrm>
+                      <a:off x="0" y="0"/>
+                      <a:ext cx="5760720" cy="1549634"/>
                     </a:xfrm>
                     <a:prstGeom prst="rect"/>
                   </pic:spPr>

</xml_diff>